<commit_message>
Ajuste en archivos por cambios
</commit_message>
<xml_diff>
--- a/ACT 3 y 6 - Python/Ejercicio_2/Manuales/Manual de Programación y Pruebas - Museo.docx
+++ b/ACT 3 y 6 - Python/Ejercicio_2/Manuales/Manual de Programación y Pruebas - Museo.docx
@@ -7835,9 +7835,15 @@
         <w:rPr>
           <w:lang w:val="es-CO"/>
         </w:rPr>
-        <w:t>Prueba de Escritorio (Caso: Compra de Smart TV)</w:t>
+        <w:t xml:space="preserve">Prueba de Escritorio </w:t>
       </w:r>
       <w:bookmarkEnd w:id="3"/>
+      <w:r>
+        <w:rPr>
+          <w:lang w:val="es-CO"/>
+        </w:rPr>
+        <w:t>Caso: Gestión de Obras de Arte)</w:t>
+      </w:r>
     </w:p>
     <w:tbl>
       <w:tblPr>

</xml_diff>